<commit_message>
AUTSL raporundaki önceki karşılaştırma tablosunu geri yükle
</commit_message>
<xml_diff>
--- a/docs/MODEL_EGITIMI_Ilerleme_Raporu_AUTSL.docx
+++ b/docs/MODEL_EGITIMI_Ilerleme_Raporu_AUTSL.docx
@@ -481,16 +481,15 @@
           </w:tcPr>
           <w:p>
             <w:pPr>
-              <w:spacing w:after="40" w:before="40"/>
+              <w:spacing w:before="0" w:after="0"/>
             </w:pPr>
             <w:r>
               <w:rPr>
-                <w:rFonts w:ascii="Aptos" w:hAnsi="Aptos"/>
                 <w:b/>
                 <w:color w:val="FFFFFF"/>
                 <w:sz w:val="17"/>
               </w:rPr>
-              <w:t>Kütüphane / model</w:t>
+              <w:t>Kütüphane / Model</w:t>
             </w:r>
           </w:p>
         </w:tc>
@@ -508,16 +507,15 @@
           </w:tcPr>
           <w:p>
             <w:pPr>
-              <w:spacing w:after="40" w:before="40"/>
+              <w:spacing w:before="0" w:after="0"/>
             </w:pPr>
             <w:r>
               <w:rPr>
-                <w:rFonts w:ascii="Aptos" w:hAnsi="Aptos"/>
                 <w:b/>
                 <w:color w:val="FFFFFF"/>
                 <w:sz w:val="17"/>
               </w:rPr>
-              <w:t>Girdi</w:t>
+              <w:t>Zor Poz Doğruluğu</w:t>
             </w:r>
           </w:p>
         </w:tc>
@@ -535,16 +533,15 @@
           </w:tcPr>
           <w:p>
             <w:pPr>
-              <w:spacing w:after="40" w:before="40"/>
+              <w:spacing w:before="0" w:after="0"/>
             </w:pPr>
             <w:r>
               <w:rPr>
-                <w:rFonts w:ascii="Aptos" w:hAnsi="Aptos"/>
                 <w:b/>
                 <w:color w:val="FFFFFF"/>
                 <w:sz w:val="17"/>
               </w:rPr>
-              <w:t>Proje deneyi</w:t>
+              <w:t>CPU Hızı</w:t>
             </w:r>
           </w:p>
         </w:tc>
@@ -562,16 +559,15 @@
           </w:tcPr>
           <w:p>
             <w:pPr>
-              <w:spacing w:after="40" w:before="40"/>
+              <w:spacing w:before="0" w:after="0"/>
             </w:pPr>
             <w:r>
               <w:rPr>
-                <w:rFonts w:ascii="Aptos" w:hAnsi="Aptos"/>
                 <w:b/>
                 <w:color w:val="FFFFFF"/>
                 <w:sz w:val="17"/>
               </w:rPr>
-              <w:t>Mobil hız</w:t>
+              <w:t>Mobil / Web Uyumu</w:t>
             </w:r>
           </w:p>
         </w:tc>
@@ -589,16 +585,15 @@
           </w:tcPr>
           <w:p>
             <w:pPr>
-              <w:spacing w:after="40" w:before="40"/>
+              <w:spacing w:before="0" w:after="0"/>
             </w:pPr>
             <w:r>
               <w:rPr>
-                <w:rFonts w:ascii="Aptos" w:hAnsi="Aptos"/>
                 <w:b/>
                 <w:color w:val="FFFFFF"/>
                 <w:sz w:val="17"/>
               </w:rPr>
-              <w:t>Sunucu hız</w:t>
+              <w:t>Donanım / Maliyet</w:t>
             </w:r>
           </w:p>
         </w:tc>
@@ -616,16 +611,15 @@
           </w:tcPr>
           <w:p>
             <w:pPr>
-              <w:spacing w:after="40" w:before="40"/>
+              <w:spacing w:before="0" w:after="0"/>
             </w:pPr>
             <w:r>
               <w:rPr>
-                <w:rFonts w:ascii="Aptos" w:hAnsi="Aptos"/>
                 <w:b/>
                 <w:color w:val="FFFFFF"/>
                 <w:sz w:val="17"/>
               </w:rPr>
-              <w:t>Şimdiki karar</w:t>
+              <w:t>Proje Kararı</w:t>
             </w:r>
           </w:p>
         </w:tc>
@@ -647,16 +641,13 @@
           </w:tcPr>
           <w:p>
             <w:pPr>
-              <w:spacing w:after="40" w:before="40"/>
+              <w:spacing w:before="0" w:after="0"/>
             </w:pPr>
             <w:r>
               <w:rPr>
-                <w:rFonts w:ascii="Aptos" w:hAnsi="Aptos"/>
-                <w:b w:val="0"/>
-                <w:color w:val="000000"/>
-                <w:sz w:val="18"/>
+                <w:sz w:val="17"/>
               </w:rPr>
-              <w:t>MediaPipe</w:t>
+              <w:t>MediaPipe (Google)</w:t>
             </w:r>
           </w:p>
         </w:tc>
@@ -673,16 +664,13 @@
           </w:tcPr>
           <w:p>
             <w:pPr>
-              <w:spacing w:after="40" w:before="40"/>
+              <w:spacing w:before="0" w:after="0"/>
             </w:pPr>
             <w:r>
               <w:rPr>
-                <w:rFonts w:ascii="Aptos" w:hAnsi="Aptos"/>
-                <w:b w:val="0"/>
-                <w:color w:val="000000"/>
-                <w:sz w:val="18"/>
+                <w:sz w:val="17"/>
               </w:rPr>
-              <w:t>Gövde + iki el</w:t>
+              <w:t>İyi / Dengeli</w:t>
             </w:r>
           </w:p>
         </w:tc>
@@ -699,16 +687,13 @@
           </w:tcPr>
           <w:p>
             <w:pPr>
-              <w:spacing w:after="40" w:before="40"/>
+              <w:spacing w:before="0" w:after="0"/>
             </w:pPr>
             <w:r>
               <w:rPr>
-                <w:rFonts w:ascii="Aptos" w:hAnsi="Aptos"/>
-                <w:b w:val="0"/>
-                <w:color w:val="000000"/>
-                <w:sz w:val="18"/>
+                <w:sz w:val="17"/>
               </w:rPr>
-              <w:t>100 sınıf cache ve pilot</w:t>
+              <w:t>30+ FPS (Çok hızlı)</w:t>
             </w:r>
           </w:p>
         </w:tc>
@@ -725,16 +710,13 @@
           </w:tcPr>
           <w:p>
             <w:pPr>
-              <w:spacing w:after="40" w:before="40"/>
+              <w:spacing w:before="0" w:after="0"/>
             </w:pPr>
             <w:r>
               <w:rPr>
-                <w:rFonts w:ascii="Aptos" w:hAnsi="Aptos"/>
-                <w:b w:val="0"/>
-                <w:color w:val="000000"/>
-                <w:sz w:val="18"/>
+                <w:sz w:val="17"/>
               </w:rPr>
-              <w:t>Ölçülmedi</w:t>
+              <w:t>Kusursuz (Android/iOS SDK, WASM)</w:t>
             </w:r>
           </w:p>
         </w:tc>
@@ -751,16 +733,13 @@
           </w:tcPr>
           <w:p>
             <w:pPr>
-              <w:spacing w:after="40" w:before="40"/>
+              <w:spacing w:before="0" w:after="0"/>
             </w:pPr>
             <w:r>
               <w:rPr>
-                <w:rFonts w:ascii="Aptos" w:hAnsi="Aptos"/>
-                <w:b w:val="0"/>
-                <w:color w:val="000000"/>
-                <w:sz w:val="18"/>
+                <w:sz w:val="17"/>
               </w:rPr>
-              <w:t>Ölçülmedi</w:t>
+              <w:t>0 TL (İstemci tarafında)</w:t>
             </w:r>
           </w:p>
         </w:tc>
@@ -777,16 +756,13 @@
           </w:tcPr>
           <w:p>
             <w:pPr>
-              <w:spacing w:after="40" w:before="40"/>
+              <w:spacing w:before="0" w:after="0"/>
             </w:pPr>
             <w:r>
               <w:rPr>
-                <w:rFonts w:ascii="Aptos" w:hAnsi="Aptos"/>
-                <w:b w:val="0"/>
-                <w:color w:val="000000"/>
-                <w:sz w:val="18"/>
+                <w:sz w:val="17"/>
               </w:rPr>
-              <w:t>v1 korunuyor</w:t>
+              <w:t>Kabul (Uç cihaz / gerçek zamanlı)</w:t>
             </w:r>
           </w:p>
         </w:tc>
@@ -808,14 +784,11 @@
           </w:tcPr>
           <w:p>
             <w:pPr>
-              <w:spacing w:after="40" w:before="40"/>
+              <w:spacing w:before="0" w:after="0"/>
             </w:pPr>
             <w:r>
               <w:rPr>
-                <w:rFonts w:ascii="Aptos" w:hAnsi="Aptos"/>
-                <w:b w:val="0"/>
-                <w:color w:val="000000"/>
-                <w:sz w:val="18"/>
+                <w:sz w:val="17"/>
               </w:rPr>
               <w:t>MMPose / RTMPose</w:t>
             </w:r>
@@ -834,16 +807,13 @@
           </w:tcPr>
           <w:p>
             <w:pPr>
-              <w:spacing w:after="40" w:before="40"/>
+              <w:spacing w:before="0" w:after="0"/>
             </w:pPr>
             <w:r>
               <w:rPr>
-                <w:rFonts w:ascii="Aptos" w:hAnsi="Aptos"/>
-                <w:b w:val="0"/>
-                <w:color w:val="000000"/>
-                <w:sz w:val="18"/>
+                <w:sz w:val="17"/>
               </w:rPr>
-              <w:t>Whole-body adayı</w:t>
+              <w:t>Çok Yüksek</w:t>
             </w:r>
           </w:p>
         </w:tc>
@@ -860,16 +830,13 @@
           </w:tcPr>
           <w:p>
             <w:pPr>
-              <w:spacing w:after="40" w:before="40"/>
+              <w:spacing w:before="0" w:after="0"/>
             </w:pPr>
             <w:r>
               <w:rPr>
-                <w:rFonts w:ascii="Aptos" w:hAnsi="Aptos"/>
-                <w:b w:val="0"/>
-                <w:color w:val="000000"/>
-                <w:sz w:val="18"/>
+                <w:sz w:val="17"/>
               </w:rPr>
-              <w:t>Yok</w:t>
+              <w:t>5–12 FPS (Yavaş)</w:t>
             </w:r>
           </w:p>
         </w:tc>
@@ -886,16 +853,13 @@
           </w:tcPr>
           <w:p>
             <w:pPr>
-              <w:spacing w:after="40" w:before="40"/>
+              <w:spacing w:before="0" w:after="0"/>
             </w:pPr>
             <w:r>
               <w:rPr>
-                <w:rFonts w:ascii="Aptos" w:hAnsi="Aptos"/>
-                <w:b w:val="0"/>
-                <w:color w:val="000000"/>
-                <w:sz w:val="18"/>
+                <w:sz w:val="17"/>
               </w:rPr>
-              <w:t>Ölçülmedi</w:t>
+              <w:t>Zor (Sunucu / GPU portu gerekir)</w:t>
             </w:r>
           </w:p>
         </w:tc>
@@ -912,16 +876,13 @@
           </w:tcPr>
           <w:p>
             <w:pPr>
-              <w:spacing w:after="40" w:before="40"/>
+              <w:spacing w:before="0" w:after="0"/>
             </w:pPr>
             <w:r>
               <w:rPr>
-                <w:rFonts w:ascii="Aptos" w:hAnsi="Aptos"/>
-                <w:b w:val="0"/>
-                <w:color w:val="000000"/>
-                <w:sz w:val="18"/>
+                <w:sz w:val="17"/>
               </w:rPr>
-              <w:t>Ölçülmedi</w:t>
+              <w:t>Yüksek GPU maliyeti</w:t>
             </w:r>
           </w:p>
         </w:tc>
@@ -938,16 +899,13 @@
           </w:tcPr>
           <w:p>
             <w:pPr>
-              <w:spacing w:after="40" w:before="40"/>
+              <w:spacing w:before="0" w:after="0"/>
             </w:pPr>
             <w:r>
               <w:rPr>
-                <w:rFonts w:ascii="Aptos" w:hAnsi="Aptos"/>
-                <w:b w:val="0"/>
-                <w:color w:val="000000"/>
-                <w:sz w:val="18"/>
+                <w:sz w:val="17"/>
               </w:rPr>
-              <w:t>Geçiş yok</w:t>
+              <w:t>Elendi (Mobil gecikme / bağımlılık)</w:t>
             </w:r>
           </w:p>
         </w:tc>
@@ -969,16 +927,13 @@
           </w:tcPr>
           <w:p>
             <w:pPr>
-              <w:spacing w:after="40" w:before="40"/>
+              <w:spacing w:before="0" w:after="0"/>
             </w:pPr>
             <w:r>
               <w:rPr>
-                <w:rFonts w:ascii="Aptos" w:hAnsi="Aptos"/>
-                <w:b w:val="0"/>
-                <w:color w:val="000000"/>
-                <w:sz w:val="18"/>
+                <w:sz w:val="17"/>
               </w:rPr>
-              <w:t>DWPose</w:t>
+              <w:t>DWPose (ECCV 2024)</w:t>
             </w:r>
           </w:p>
         </w:tc>
@@ -995,16 +950,13 @@
           </w:tcPr>
           <w:p>
             <w:pPr>
-              <w:spacing w:after="40" w:before="40"/>
+              <w:spacing w:before="0" w:after="0"/>
             </w:pPr>
             <w:r>
               <w:rPr>
-                <w:rFonts w:ascii="Aptos" w:hAnsi="Aptos"/>
-                <w:b w:val="0"/>
-                <w:color w:val="000000"/>
-                <w:sz w:val="18"/>
+                <w:sz w:val="17"/>
               </w:rPr>
-              <w:t>Pose/hand adayı</w:t>
+              <w:t>SOTA (En Yüksek)</w:t>
             </w:r>
           </w:p>
         </w:tc>
@@ -1021,16 +973,13 @@
           </w:tcPr>
           <w:p>
             <w:pPr>
-              <w:spacing w:after="40" w:before="40"/>
+              <w:spacing w:before="0" w:after="0"/>
             </w:pPr>
             <w:r>
               <w:rPr>
-                <w:rFonts w:ascii="Aptos" w:hAnsi="Aptos"/>
-                <w:b w:val="0"/>
-                <w:color w:val="000000"/>
-                <w:sz w:val="18"/>
+                <w:sz w:val="17"/>
               </w:rPr>
-              <w:t>Yok</w:t>
+              <w:t>2–5 FPS (Çok Yavaş)</w:t>
             </w:r>
           </w:p>
         </w:tc>
@@ -1047,16 +996,13 @@
           </w:tcPr>
           <w:p>
             <w:pPr>
-              <w:spacing w:after="40" w:before="40"/>
+              <w:spacing w:before="0" w:after="0"/>
             </w:pPr>
             <w:r>
               <w:rPr>
-                <w:rFonts w:ascii="Aptos" w:hAnsi="Aptos"/>
-                <w:b w:val="0"/>
-                <w:color w:val="000000"/>
-                <w:sz w:val="18"/>
+                <w:sz w:val="17"/>
               </w:rPr>
-              <w:t>Ölçülmedi</w:t>
+              <w:t>Çok Zor (Büyük model boyutu)</w:t>
             </w:r>
           </w:p>
         </w:tc>
@@ -1073,16 +1019,13 @@
           </w:tcPr>
           <w:p>
             <w:pPr>
-              <w:spacing w:after="40" w:before="40"/>
+              <w:spacing w:before="0" w:after="0"/>
             </w:pPr>
             <w:r>
               <w:rPr>
-                <w:rFonts w:ascii="Aptos" w:hAnsi="Aptos"/>
-                <w:b w:val="0"/>
-                <w:color w:val="000000"/>
-                <w:sz w:val="18"/>
+                <w:sz w:val="17"/>
               </w:rPr>
-              <w:t>Ölçülmedi</w:t>
+              <w:t>Çok Yüksek GPU maliyeti</w:t>
             </w:r>
           </w:p>
         </w:tc>
@@ -1099,16 +1042,13 @@
           </w:tcPr>
           <w:p>
             <w:pPr>
-              <w:spacing w:after="40" w:before="40"/>
+              <w:spacing w:before="0" w:after="0"/>
             </w:pPr>
             <w:r>
               <w:rPr>
-                <w:rFonts w:ascii="Aptos" w:hAnsi="Aptos"/>
-                <w:b w:val="0"/>
-                <w:color w:val="000000"/>
-                <w:sz w:val="18"/>
+                <w:sz w:val="17"/>
               </w:rPr>
-              <w:t>Geçiş yok</w:t>
+              <w:t>Elendi (Canlı kamera için aşırı ağır)</w:t>
             </w:r>
           </w:p>
         </w:tc>
@@ -1130,16 +1070,13 @@
           </w:tcPr>
           <w:p>
             <w:pPr>
-              <w:spacing w:after="40" w:before="40"/>
+              <w:spacing w:before="0" w:after="0"/>
             </w:pPr>
             <w:r>
               <w:rPr>
-                <w:rFonts w:ascii="Aptos" w:hAnsi="Aptos"/>
-                <w:b w:val="0"/>
-                <w:color w:val="000000"/>
-                <w:sz w:val="18"/>
+                <w:sz w:val="17"/>
               </w:rPr>
-              <w:t>YOLO pose</w:t>
+              <w:t>YOLOv8 / v11 Pose</w:t>
             </w:r>
           </w:p>
         </w:tc>
@@ -1156,16 +1093,13 @@
           </w:tcPr>
           <w:p>
             <w:pPr>
-              <w:spacing w:after="40" w:before="40"/>
+              <w:spacing w:before="0" w:after="0"/>
             </w:pPr>
             <w:r>
               <w:rPr>
-                <w:rFonts w:ascii="Aptos" w:hAnsi="Aptos"/>
-                <w:b w:val="0"/>
-                <w:color w:val="000000"/>
-                <w:sz w:val="18"/>
+                <w:sz w:val="17"/>
               </w:rPr>
-              <w:t>Sürüme bağlı</w:t>
+              <w:t>İyi (Yalnız Gövde)</w:t>
             </w:r>
           </w:p>
         </w:tc>
@@ -1182,16 +1116,13 @@
           </w:tcPr>
           <w:p>
             <w:pPr>
-              <w:spacing w:after="40" w:before="40"/>
+              <w:spacing w:before="0" w:after="0"/>
             </w:pPr>
             <w:r>
               <w:rPr>
-                <w:rFonts w:ascii="Aptos" w:hAnsi="Aptos"/>
-                <w:b w:val="0"/>
-                <w:color w:val="000000"/>
-                <w:sz w:val="18"/>
+                <w:sz w:val="17"/>
               </w:rPr>
-              <w:t>Yok</w:t>
+              <w:t>25+ FPS (Hızlı)</w:t>
             </w:r>
           </w:p>
         </w:tc>
@@ -1208,16 +1139,13 @@
           </w:tcPr>
           <w:p>
             <w:pPr>
-              <w:spacing w:after="40" w:before="40"/>
+              <w:spacing w:before="0" w:after="0"/>
             </w:pPr>
             <w:r>
               <w:rPr>
-                <w:rFonts w:ascii="Aptos" w:hAnsi="Aptos"/>
-                <w:b w:val="0"/>
-                <w:color w:val="000000"/>
-                <w:sz w:val="18"/>
+                <w:sz w:val="17"/>
               </w:rPr>
-              <w:t>Ölçülmedi</w:t>
+              <w:t>İyi (ONNX / TFLite)</w:t>
             </w:r>
           </w:p>
         </w:tc>
@@ -1234,16 +1162,13 @@
           </w:tcPr>
           <w:p>
             <w:pPr>
-              <w:spacing w:after="40" w:before="40"/>
+              <w:spacing w:before="0" w:after="0"/>
             </w:pPr>
             <w:r>
               <w:rPr>
-                <w:rFonts w:ascii="Aptos" w:hAnsi="Aptos"/>
-                <w:b w:val="0"/>
-                <w:color w:val="000000"/>
-                <w:sz w:val="18"/>
+                <w:sz w:val="17"/>
               </w:rPr>
-              <w:t>Ölçülmedi</w:t>
+              <w:t>Düşük / Orta</w:t>
             </w:r>
           </w:p>
         </w:tc>
@@ -1260,16 +1185,13 @@
           </w:tcPr>
           <w:p>
             <w:pPr>
-              <w:spacing w:after="40" w:before="40"/>
+              <w:spacing w:before="0" w:after="0"/>
             </w:pPr>
             <w:r>
               <w:rPr>
-                <w:rFonts w:ascii="Aptos" w:hAnsi="Aptos"/>
-                <w:b w:val="0"/>
-                <w:color w:val="000000"/>
-                <w:sz w:val="18"/>
+                <w:sz w:val="17"/>
               </w:rPr>
-              <w:t>Geçiş yok</w:t>
+              <w:t>Elendi (21 parmak noktası yok)</w:t>
             </w:r>
           </w:p>
         </w:tc>
@@ -1291,16 +1213,13 @@
           </w:tcPr>
           <w:p>
             <w:pPr>
-              <w:spacing w:after="40" w:before="40"/>
+              <w:spacing w:before="0" w:after="0"/>
             </w:pPr>
             <w:r>
               <w:rPr>
-                <w:rFonts w:ascii="Aptos" w:hAnsi="Aptos"/>
-                <w:b w:val="0"/>
-                <w:color w:val="000000"/>
-                <w:sz w:val="18"/>
+                <w:sz w:val="17"/>
               </w:rPr>
-              <w:t>OpenPose</w:t>
+              <w:t>OpenPose (CMU)</w:t>
             </w:r>
           </w:p>
         </w:tc>
@@ -1317,16 +1236,13 @@
           </w:tcPr>
           <w:p>
             <w:pPr>
-              <w:spacing w:after="40" w:before="40"/>
+              <w:spacing w:before="0" w:after="0"/>
             </w:pPr>
             <w:r>
               <w:rPr>
-                <w:rFonts w:ascii="Aptos" w:hAnsi="Aptos"/>
-                <w:b w:val="0"/>
-                <w:color w:val="000000"/>
-                <w:sz w:val="18"/>
+                <w:sz w:val="17"/>
               </w:rPr>
-              <w:t>Whole-body adayı</w:t>
+              <w:t>Orta</w:t>
             </w:r>
           </w:p>
         </w:tc>
@@ -1343,16 +1259,13 @@
           </w:tcPr>
           <w:p>
             <w:pPr>
-              <w:spacing w:after="40" w:before="40"/>
+              <w:spacing w:before="0" w:after="0"/>
             </w:pPr>
             <w:r>
               <w:rPr>
-                <w:rFonts w:ascii="Aptos" w:hAnsi="Aptos"/>
-                <w:b w:val="0"/>
-                <w:color w:val="000000"/>
-                <w:sz w:val="18"/>
+                <w:sz w:val="17"/>
               </w:rPr>
-              <w:t>Yok</w:t>
+              <w:t>&lt; 2 FPS (Çok hantal)</w:t>
             </w:r>
           </w:p>
         </w:tc>
@@ -1369,16 +1282,13 @@
           </w:tcPr>
           <w:p>
             <w:pPr>
-              <w:spacing w:after="40" w:before="40"/>
+              <w:spacing w:before="0" w:after="0"/>
             </w:pPr>
             <w:r>
               <w:rPr>
-                <w:rFonts w:ascii="Aptos" w:hAnsi="Aptos"/>
-                <w:b w:val="0"/>
-                <w:color w:val="000000"/>
-                <w:sz w:val="18"/>
+                <w:sz w:val="17"/>
               </w:rPr>
-              <w:t>Ölçülmedi</w:t>
+              <w:t>Kullanılamaz</w:t>
             </w:r>
           </w:p>
         </w:tc>
@@ -1395,16 +1305,13 @@
           </w:tcPr>
           <w:p>
             <w:pPr>
-              <w:spacing w:after="40" w:before="40"/>
+              <w:spacing w:before="0" w:after="0"/>
             </w:pPr>
             <w:r>
               <w:rPr>
-                <w:rFonts w:ascii="Aptos" w:hAnsi="Aptos"/>
-                <w:b w:val="0"/>
-                <w:color w:val="000000"/>
-                <w:sz w:val="18"/>
+                <w:sz w:val="17"/>
               </w:rPr>
-              <w:t>Ölçülmedi</w:t>
+              <w:t>Yüksek + 25.000$ lisans</w:t>
             </w:r>
           </w:p>
         </w:tc>
@@ -1421,16 +1328,13 @@
           </w:tcPr>
           <w:p>
             <w:pPr>
-              <w:spacing w:after="40" w:before="40"/>
+              <w:spacing w:before="0" w:after="0"/>
             </w:pPr>
             <w:r>
               <w:rPr>
-                <w:rFonts w:ascii="Aptos" w:hAnsi="Aptos"/>
-                <w:b w:val="0"/>
-                <w:color w:val="000000"/>
-                <w:sz w:val="18"/>
+                <w:sz w:val="17"/>
               </w:rPr>
-              <w:t>Geçiş yok</w:t>
+              <w:t>Elendi (Eski / Lisans engeli)</w:t>
             </w:r>
           </w:p>
         </w:tc>

</xml_diff>